<commit_message>
Fill Chapter 4.5 attack comparison
</commit_message>
<xml_diff>
--- a/docs/LUAN_VAN_DRAFT.docx
+++ b/docs/LUAN_VAN_DRAFT.docx
@@ -5146,77 +5146,150 @@
           <w:i w:val="0"/>
           <w:sz w:val="28"/>
         </w:rPr>
-        <w:t>4.5. So sánh GeoTox với các tấn công nền (best ASR theo phòng thủ)</w:t>
+        <w:t>4.5. So sánh GeoTox với các tấn công nền</w:t>
       </w:r>
     </w:p>
     <w:p>
-      <w:pPr>
-        <w:ind w:left="283"/>
-      </w:pPr>
-      <w:r>
-        <w:rPr>
-          <w:rFonts w:ascii="Times New Roman" w:hAnsi="Times New Roman" w:eastAsia="Times New Roman"/>
-          <w:b w:val="0"/>
-          <w:i/>
-          <w:color w:val="444444"/>
-          <w:sz w:val="24"/>
-        </w:rPr>
-        <w:t xml:space="preserve">Chạy </w:t>
-      </w:r>
-      <w:r>
-        <w:rPr>
-          <w:rFonts w:ascii="Times New Roman" w:hAnsi="Times New Roman" w:eastAsia="Times New Roman"/>
-          <w:b w:val="0"/>
-          <w:i/>
-          <w:color w:val="444444"/>
-          <w:sz w:val="24"/>
-        </w:rPr>
-        <w:t>python3 run_baselines.py</w:t>
-      </w:r>
-      <w:r>
-        <w:rPr>
-          <w:rFonts w:ascii="Times New Roman" w:hAnsi="Times New Roman" w:eastAsia="Times New Roman"/>
-          <w:b w:val="0"/>
-          <w:i/>
-          <w:color w:val="444444"/>
-          <w:sz w:val="24"/>
-        </w:rPr>
-        <w:t xml:space="preserve"> rồi </w:t>
-      </w:r>
-      <w:r>
-        <w:rPr>
-          <w:rFonts w:ascii="Times New Roman" w:hAnsi="Times New Roman" w:eastAsia="Times New Roman"/>
-          <w:b w:val="0"/>
-          <w:i/>
-          <w:color w:val="444444"/>
-          <w:sz w:val="24"/>
-        </w:rPr>
-        <w:t>python3 analyze_results.py</w:t>
-      </w:r>
-      <w:r>
-        <w:rPr>
-          <w:rFonts w:ascii="Times New Roman" w:hAnsi="Times New Roman" w:eastAsia="Times New Roman"/>
-          <w:b w:val="0"/>
-          <w:i/>
-          <w:color w:val="444444"/>
-          <w:sz w:val="24"/>
-        </w:rPr>
-        <w:t xml:space="preserve"> (bảng *Attack</w:t>
+      <w:r>
+        <w:rPr>
+          <w:rFonts w:ascii="Times New Roman" w:hAnsi="Times New Roman" w:eastAsia="Times New Roman"/>
+          <w:b w:val="0"/>
+          <w:i w:val="0"/>
+          <w:sz w:val="26"/>
+        </w:rPr>
+        <w:t xml:space="preserve">Để định vị GeoTox so với các tấn công có sẵn, ta chạy chúng dưới </w:t>
+      </w:r>
+      <w:r>
+        <w:rPr>
+          <w:rFonts w:ascii="Times New Roman" w:hAnsi="Times New Roman" w:eastAsia="Times New Roman"/>
+          <w:b/>
+          <w:i w:val="0"/>
+          <w:sz w:val="26"/>
+        </w:rPr>
+      </w:r>
+      <w:r>
+        <w:rPr>
+          <w:rFonts w:ascii="Times New Roman" w:hAnsi="Times New Roman" w:eastAsia="Times New Roman"/>
+          <w:b w:val="0"/>
+          <w:i w:val="0"/>
+          <w:sz w:val="26"/>
+        </w:rPr>
+        <w:t>cùng phòng</w:t>
       </w:r>
     </w:p>
     <w:p>
-      <w:pPr>
-        <w:ind w:left="283"/>
-      </w:pPr>
-      <w:r>
-        <w:rPr>
-          <w:rFonts w:ascii="Times New Roman" w:hAnsi="Times New Roman" w:eastAsia="Times New Roman"/>
-          <w:b w:val="0"/>
-          <w:i/>
-          <w:color w:val="444444"/>
-          <w:sz w:val="24"/>
-        </w:rPr>
-        <w:t>comparison*) để điền. Mẫu bảng:</w:t>
+      <w:r>
+        <w:rPr>
+          <w:rFonts w:ascii="Times New Roman" w:hAnsi="Times New Roman" w:eastAsia="Times New Roman"/>
+          <w:b w:val="0"/>
+          <w:i w:val="0"/>
+          <w:sz w:val="26"/>
+        </w:rPr>
+        <w:t>thủ</w:t>
+      </w:r>
+      <w:r>
+        <w:rPr>
+          <w:rFonts w:ascii="Times New Roman" w:hAnsi="Times New Roman" w:eastAsia="Times New Roman"/>
+          <w:b/>
+          <w:i w:val="0"/>
+          <w:sz w:val="26"/>
+        </w:rPr>
+        <w:t xml:space="preserve"> (MNIST, $\alpha=0.5$, 20% độc, 30 vòng, 3 seed). Tấn công </w:t>
+      </w:r>
+      <w:r>
+        <w:rPr>
+          <w:rFonts w:ascii="Times New Roman" w:hAnsi="Times New Roman" w:eastAsia="Times New Roman"/>
+          <w:b w:val="0"/>
+          <w:i w:val="0"/>
+          <w:sz w:val="26"/>
+        </w:rPr>
+        <w:t>backdoor</w:t>
+      </w:r>
+      <w:r>
+        <w:rPr>
+          <w:rFonts w:ascii="Times New Roman" w:hAnsi="Times New Roman" w:eastAsia="Times New Roman"/>
+          <w:b/>
+          <w:i w:val="0"/>
+          <w:sz w:val="26"/>
+        </w:rPr>
+      </w:r>
+    </w:p>
+    <w:p>
+      <w:r>
+        <w:rPr>
+          <w:rFonts w:ascii="Times New Roman" w:hAnsi="Times New Roman" w:eastAsia="Times New Roman"/>
+          <w:b w:val="0"/>
+          <w:i w:val="0"/>
+          <w:sz w:val="26"/>
+        </w:rPr>
+        <w:t xml:space="preserve">(targeted) so bằng </w:t>
+      </w:r>
+      <w:r>
+        <w:rPr>
+          <w:rFonts w:ascii="Times New Roman" w:hAnsi="Times New Roman" w:eastAsia="Times New Roman"/>
+          <w:b/>
+          <w:i w:val="0"/>
+          <w:sz w:val="26"/>
+        </w:rPr>
+        <w:t>ASR</w:t>
+      </w:r>
+      <w:r>
+        <w:rPr>
+          <w:rFonts w:ascii="Times New Roman" w:hAnsi="Times New Roman" w:eastAsia="Times New Roman"/>
+          <w:b w:val="0"/>
+          <w:i w:val="0"/>
+          <w:sz w:val="26"/>
+        </w:rPr>
+        <w:t xml:space="preserve">; tấn công </w:t>
+      </w:r>
+      <w:r>
+        <w:rPr>
+          <w:rFonts w:ascii="Times New Roman" w:hAnsi="Times New Roman" w:eastAsia="Times New Roman"/>
+          <w:b/>
+          <w:i w:val="0"/>
+          <w:sz w:val="26"/>
+        </w:rPr>
+        <w:t>untargeted</w:t>
+      </w:r>
+      <w:r>
+        <w:rPr>
+          <w:rFonts w:ascii="Times New Roman" w:hAnsi="Times New Roman" w:eastAsia="Times New Roman"/>
+          <w:b w:val="0"/>
+          <w:i w:val="0"/>
+          <w:sz w:val="26"/>
+        </w:rPr>
+        <w:t xml:space="preserve"> (LIE, Min-Max) so bằng mức</w:t>
+      </w:r>
+    </w:p>
+    <w:p>
+      <w:r>
+        <w:rPr>
+          <w:rFonts w:ascii="Times New Roman" w:hAnsi="Times New Roman" w:eastAsia="Times New Roman"/>
+          <w:b/>
+          <w:i w:val="0"/>
+          <w:sz w:val="26"/>
+        </w:rPr>
+        <w:t>sụt độ chính xác (MA)</w:t>
+      </w:r>
+      <w:r>
+        <w:rPr>
+          <w:rFonts w:ascii="Times New Roman" w:hAnsi="Times New Roman" w:eastAsia="Times New Roman"/>
+          <w:b w:val="0"/>
+          <w:i w:val="0"/>
+          <w:sz w:val="26"/>
+        </w:rPr>
+        <w:t xml:space="preserve"> vì chúng không có ASR.</w:t>
+      </w:r>
+    </w:p>
+    <w:p>
+      <w:r>
+        <w:rPr>
+          <w:rFonts w:ascii="Times New Roman" w:hAnsi="Times New Roman" w:eastAsia="Times New Roman"/>
+          <w:b/>
+          <w:i w:val="0"/>
+          <w:sz w:val="26"/>
+        </w:rPr>
+        <w:t>Bảng 4.3 — ASR (best, mean±std %) của tấn công backdoor theo phòng thủ:</w:t>
       </w:r>
     </w:p>
     <w:tbl>
@@ -5226,17 +5299,14 @@
         <w:tblLook w:firstColumn="1" w:firstRow="1" w:lastColumn="0" w:lastRow="0" w:noHBand="0" w:noVBand="1" w:val="04A0"/>
       </w:tblPr>
       <w:tblGrid>
-        <w:gridCol w:w="1520"/>
-        <w:gridCol w:w="1520"/>
-        <w:gridCol w:w="1520"/>
-        <w:gridCol w:w="1520"/>
-        <w:gridCol w:w="1520"/>
-        <w:gridCol w:w="1520"/>
+        <w:gridCol w:w="3041"/>
+        <w:gridCol w:w="3041"/>
+        <w:gridCol w:w="3041"/>
       </w:tblGrid>
       <w:tr>
         <w:tc>
           <w:tcPr>
-            <w:tcW w:type="dxa" w:w="1520"/>
+            <w:tcW w:type="dxa" w:w="3041"/>
           </w:tcPr>
           <w:p>
             <w:pPr>
@@ -5255,7 +5325,345 @@
         </w:tc>
         <w:tc>
           <w:tcPr>
-            <w:tcW w:type="dxa" w:w="1520"/>
+            <w:tcW w:type="dxa" w:w="3041"/>
+          </w:tcPr>
+          <w:p>
+            <w:pPr>
+              <w:spacing w:line="240" w:lineRule="auto"/>
+            </w:pPr>
+            <w:r>
+              <w:rPr>
+                <w:rFonts w:ascii="Times New Roman" w:hAnsi="Times New Roman" w:eastAsia="Times New Roman"/>
+                <w:b/>
+                <w:i w:val="0"/>
+                <w:sz w:val="22"/>
+              </w:rPr>
+              <w:t>Model-Replacement</w:t>
+            </w:r>
+          </w:p>
+        </w:tc>
+        <w:tc>
+          <w:tcPr>
+            <w:tcW w:type="dxa" w:w="3041"/>
+          </w:tcPr>
+          <w:p>
+            <w:pPr>
+              <w:spacing w:line="240" w:lineRule="auto"/>
+            </w:pPr>
+            <w:r>
+              <w:rPr>
+                <w:rFonts w:ascii="Times New Roman" w:hAnsi="Times New Roman" w:eastAsia="Times New Roman"/>
+                <w:b/>
+                <w:i w:val="0"/>
+                <w:sz w:val="22"/>
+              </w:rPr>
+              <w:t>GeoTox (best τ)</w:t>
+            </w:r>
+          </w:p>
+        </w:tc>
+      </w:tr>
+      <w:tr>
+        <w:tc>
+          <w:tcPr>
+            <w:tcW w:type="dxa" w:w="3041"/>
+          </w:tcPr>
+          <w:p>
+            <w:pPr>
+              <w:spacing w:line="240" w:lineRule="auto"/>
+            </w:pPr>
+            <w:r>
+              <w:rPr>
+                <w:rFonts w:ascii="Times New Roman" w:hAnsi="Times New Roman" w:eastAsia="Times New Roman"/>
+                <w:b w:val="0"/>
+                <w:i w:val="0"/>
+                <w:sz w:val="22"/>
+              </w:rPr>
+              <w:t>FedAvg (không pt)</w:t>
+            </w:r>
+          </w:p>
+        </w:tc>
+        <w:tc>
+          <w:tcPr>
+            <w:tcW w:type="dxa" w:w="3041"/>
+          </w:tcPr>
+          <w:p>
+            <w:pPr>
+              <w:spacing w:line="240" w:lineRule="auto"/>
+            </w:pPr>
+            <w:r>
+              <w:rPr>
+                <w:rFonts w:ascii="Times New Roman" w:hAnsi="Times New Roman" w:eastAsia="Times New Roman"/>
+                <w:b w:val="0"/>
+                <w:i w:val="0"/>
+                <w:sz w:val="22"/>
+              </w:rPr>
+              <w:t>99.8±0.3</w:t>
+            </w:r>
+          </w:p>
+        </w:tc>
+        <w:tc>
+          <w:tcPr>
+            <w:tcW w:type="dxa" w:w="3041"/>
+          </w:tcPr>
+          <w:p>
+            <w:pPr>
+              <w:spacing w:line="240" w:lineRule="auto"/>
+            </w:pPr>
+            <w:r>
+              <w:rPr>
+                <w:rFonts w:ascii="Times New Roman" w:hAnsi="Times New Roman" w:eastAsia="Times New Roman"/>
+                <w:b w:val="0"/>
+                <w:i w:val="0"/>
+                <w:sz w:val="22"/>
+              </w:rPr>
+              <w:t>37.5±37.1</w:t>
+            </w:r>
+          </w:p>
+        </w:tc>
+      </w:tr>
+      <w:tr>
+        <w:tc>
+          <w:tcPr>
+            <w:tcW w:type="dxa" w:w="3041"/>
+          </w:tcPr>
+          <w:p>
+            <w:pPr>
+              <w:spacing w:line="240" w:lineRule="auto"/>
+            </w:pPr>
+            <w:r>
+              <w:rPr>
+                <w:rFonts w:ascii="Times New Roman" w:hAnsi="Times New Roman" w:eastAsia="Times New Roman"/>
+                <w:b/>
+                <w:i w:val="0"/>
+                <w:sz w:val="22"/>
+              </w:rPr>
+              <w:t>Krum</w:t>
+            </w:r>
+          </w:p>
+        </w:tc>
+        <w:tc>
+          <w:tcPr>
+            <w:tcW w:type="dxa" w:w="3041"/>
+          </w:tcPr>
+          <w:p>
+            <w:pPr>
+              <w:spacing w:line="240" w:lineRule="auto"/>
+            </w:pPr>
+            <w:r>
+              <w:rPr>
+                <w:rFonts w:ascii="Times New Roman" w:hAnsi="Times New Roman" w:eastAsia="Times New Roman"/>
+                <w:b/>
+                <w:i w:val="0"/>
+                <w:sz w:val="22"/>
+              </w:rPr>
+              <w:t>0.6±0.3</w:t>
+            </w:r>
+          </w:p>
+        </w:tc>
+        <w:tc>
+          <w:tcPr>
+            <w:tcW w:type="dxa" w:w="3041"/>
+          </w:tcPr>
+          <w:p>
+            <w:pPr>
+              <w:spacing w:line="240" w:lineRule="auto"/>
+            </w:pPr>
+            <w:r>
+              <w:rPr>
+                <w:rFonts w:ascii="Times New Roman" w:hAnsi="Times New Roman" w:eastAsia="Times New Roman"/>
+                <w:b/>
+                <w:i w:val="0"/>
+                <w:sz w:val="22"/>
+              </w:rPr>
+              <w:t>97.1±1.3</w:t>
+            </w:r>
+          </w:p>
+        </w:tc>
+      </w:tr>
+      <w:tr>
+        <w:tc>
+          <w:tcPr>
+            <w:tcW w:type="dxa" w:w="3041"/>
+          </w:tcPr>
+          <w:p>
+            <w:pPr>
+              <w:spacing w:line="240" w:lineRule="auto"/>
+            </w:pPr>
+            <w:r>
+              <w:rPr>
+                <w:rFonts w:ascii="Times New Roman" w:hAnsi="Times New Roman" w:eastAsia="Times New Roman"/>
+                <w:b w:val="0"/>
+                <w:i w:val="0"/>
+                <w:sz w:val="22"/>
+              </w:rPr>
+              <w:t>FLTrust</w:t>
+            </w:r>
+          </w:p>
+        </w:tc>
+        <w:tc>
+          <w:tcPr>
+            <w:tcW w:type="dxa" w:w="3041"/>
+          </w:tcPr>
+          <w:p>
+            <w:pPr>
+              <w:spacing w:line="240" w:lineRule="auto"/>
+            </w:pPr>
+            <w:r>
+              <w:rPr>
+                <w:rFonts w:ascii="Times New Roman" w:hAnsi="Times New Roman" w:eastAsia="Times New Roman"/>
+                <w:b w:val="0"/>
+                <w:i w:val="0"/>
+                <w:sz w:val="22"/>
+              </w:rPr>
+              <w:t>0.3±0.1</w:t>
+            </w:r>
+          </w:p>
+        </w:tc>
+        <w:tc>
+          <w:tcPr>
+            <w:tcW w:type="dxa" w:w="3041"/>
+          </w:tcPr>
+          <w:p>
+            <w:pPr>
+              <w:spacing w:line="240" w:lineRule="auto"/>
+            </w:pPr>
+            <w:r>
+              <w:rPr>
+                <w:rFonts w:ascii="Times New Roman" w:hAnsi="Times New Roman" w:eastAsia="Times New Roman"/>
+                <w:b w:val="0"/>
+                <w:i w:val="0"/>
+                <w:sz w:val="22"/>
+              </w:rPr>
+              <w:t>0.4±0.1</w:t>
+            </w:r>
+          </w:p>
+        </w:tc>
+      </w:tr>
+      <w:tr>
+        <w:tc>
+          <w:tcPr>
+            <w:tcW w:type="dxa" w:w="3041"/>
+          </w:tcPr>
+          <w:p>
+            <w:pPr>
+              <w:spacing w:line="240" w:lineRule="auto"/>
+            </w:pPr>
+            <w:r>
+              <w:rPr>
+                <w:rFonts w:ascii="Times New Roman" w:hAnsi="Times New Roman" w:eastAsia="Times New Roman"/>
+                <w:b w:val="0"/>
+                <w:i w:val="0"/>
+                <w:sz w:val="22"/>
+              </w:rPr>
+              <w:t>FLAME</w:t>
+            </w:r>
+          </w:p>
+        </w:tc>
+        <w:tc>
+          <w:tcPr>
+            <w:tcW w:type="dxa" w:w="3041"/>
+          </w:tcPr>
+          <w:p>
+            <w:pPr>
+              <w:spacing w:line="240" w:lineRule="auto"/>
+            </w:pPr>
+            <w:r>
+              <w:rPr>
+                <w:rFonts w:ascii="Times New Roman" w:hAnsi="Times New Roman" w:eastAsia="Times New Roman"/>
+                <w:b w:val="0"/>
+                <w:i w:val="0"/>
+                <w:sz w:val="22"/>
+              </w:rPr>
+              <w:t>96.1±3.1</w:t>
+            </w:r>
+          </w:p>
+        </w:tc>
+        <w:tc>
+          <w:tcPr>
+            <w:tcW w:type="dxa" w:w="3041"/>
+          </w:tcPr>
+          <w:p>
+            <w:pPr>
+              <w:spacing w:line="240" w:lineRule="auto"/>
+            </w:pPr>
+            <w:r>
+              <w:rPr>
+                <w:rFonts w:ascii="Times New Roman" w:hAnsi="Times New Roman" w:eastAsia="Times New Roman"/>
+                <w:b w:val="0"/>
+                <w:i w:val="0"/>
+                <w:sz w:val="22"/>
+              </w:rPr>
+              <w:t>54.7±40.6</w:t>
+            </w:r>
+          </w:p>
+        </w:tc>
+      </w:tr>
+    </w:tbl>
+    <w:p>
+      <w:r>
+        <w:rPr>
+          <w:rFonts w:ascii="Times New Roman" w:hAnsi="Times New Roman" w:eastAsia="Times New Roman"/>
+          <w:b/>
+          <w:i w:val="0"/>
+          <w:sz w:val="26"/>
+        </w:rPr>
+        <w:t>Bảng 4.4 — Độ chính xác MA (%) dưới tấn công untargeted:</w:t>
+      </w:r>
+    </w:p>
+    <w:tbl>
+      <w:tblPr>
+        <w:tblStyle w:val="TableGrid"/>
+        <w:tblW w:type="auto" w:w="0"/>
+        <w:tblLook w:firstColumn="1" w:firstRow="1" w:lastColumn="0" w:lastRow="0" w:noHBand="0" w:noVBand="1" w:val="04A0"/>
+      </w:tblPr>
+      <w:tblGrid>
+        <w:gridCol w:w="2280"/>
+        <w:gridCol w:w="2280"/>
+        <w:gridCol w:w="2280"/>
+        <w:gridCol w:w="2280"/>
+      </w:tblGrid>
+      <w:tr>
+        <w:tc>
+          <w:tcPr>
+            <w:tcW w:type="dxa" w:w="2280"/>
+          </w:tcPr>
+          <w:p>
+            <w:pPr>
+              <w:spacing w:line="240" w:lineRule="auto"/>
+            </w:pPr>
+            <w:r>
+              <w:rPr>
+                <w:rFonts w:ascii="Times New Roman" w:hAnsi="Times New Roman" w:eastAsia="Times New Roman"/>
+                <w:b/>
+                <w:i w:val="0"/>
+                <w:sz w:val="22"/>
+              </w:rPr>
+              <w:t>Phòng thủ</w:t>
+            </w:r>
+          </w:p>
+        </w:tc>
+        <w:tc>
+          <w:tcPr>
+            <w:tcW w:type="dxa" w:w="2280"/>
+          </w:tcPr>
+          <w:p>
+            <w:pPr>
+              <w:spacing w:line="240" w:lineRule="auto"/>
+            </w:pPr>
+            <w:r>
+              <w:rPr>
+                <w:rFonts w:ascii="Times New Roman" w:hAnsi="Times New Roman" w:eastAsia="Times New Roman"/>
+                <w:b/>
+                <w:i w:val="0"/>
+                <w:sz w:val="22"/>
+              </w:rPr>
+              <w:t>Không tấn công</w:t>
+            </w:r>
+          </w:p>
+        </w:tc>
+        <w:tc>
+          <w:tcPr>
+            <w:tcW w:type="dxa" w:w="2280"/>
           </w:tcPr>
           <w:p>
             <w:pPr>
@@ -5274,7 +5682,7 @@
         </w:tc>
         <w:tc>
           <w:tcPr>
-            <w:tcW w:type="dxa" w:w="1520"/>
+            <w:tcW w:type="dxa" w:w="2280"/>
           </w:tcPr>
           <w:p>
             <w:pPr>
@@ -5291,68 +5699,11 @@
             </w:r>
           </w:p>
         </w:tc>
-        <w:tc>
-          <w:tcPr>
-            <w:tcW w:type="dxa" w:w="1520"/>
-          </w:tcPr>
-          <w:p>
-            <w:pPr>
-              <w:spacing w:line="240" w:lineRule="auto"/>
-            </w:pPr>
-            <w:r>
-              <w:rPr>
-                <w:rFonts w:ascii="Times New Roman" w:hAnsi="Times New Roman" w:eastAsia="Times New Roman"/>
-                <w:b/>
-                <w:i w:val="0"/>
-                <w:sz w:val="22"/>
-              </w:rPr>
-              <w:t>Model-Repl.</w:t>
-            </w:r>
-          </w:p>
-        </w:tc>
-        <w:tc>
-          <w:tcPr>
-            <w:tcW w:type="dxa" w:w="1520"/>
-          </w:tcPr>
-          <w:p>
-            <w:pPr>
-              <w:spacing w:line="240" w:lineRule="auto"/>
-            </w:pPr>
-            <w:r>
-              <w:rPr>
-                <w:rFonts w:ascii="Times New Roman" w:hAnsi="Times New Roman" w:eastAsia="Times New Roman"/>
-                <w:b/>
-                <w:i w:val="0"/>
-                <w:sz w:val="22"/>
-              </w:rPr>
-              <w:t>GeoTox (best τ)</w:t>
-            </w:r>
-          </w:p>
-        </w:tc>
-        <w:tc>
-          <w:tcPr>
-            <w:tcW w:type="dxa" w:w="1520"/>
-          </w:tcPr>
-          <w:p>
-            <w:pPr>
-              <w:spacing w:line="240" w:lineRule="auto"/>
-            </w:pPr>
-            <w:r>
-              <w:rPr>
-                <w:rFonts w:ascii="Times New Roman" w:hAnsi="Times New Roman" w:eastAsia="Times New Roman"/>
-                <w:b/>
-                <w:i w:val="0"/>
-                <w:sz w:val="22"/>
-              </w:rPr>
-              <w:t>GeoTox-Adaptive</w:t>
-            </w:r>
-          </w:p>
-        </w:tc>
       </w:tr>
       <w:tr>
         <w:tc>
           <w:tcPr>
-            <w:tcW w:type="dxa" w:w="1520"/>
+            <w:tcW w:type="dxa" w:w="2280"/>
           </w:tcPr>
           <w:p>
             <w:pPr>
@@ -5371,7 +5722,7 @@
         </w:tc>
         <w:tc>
           <w:tcPr>
-            <w:tcW w:type="dxa" w:w="1520"/>
+            <w:tcW w:type="dxa" w:w="2280"/>
           </w:tcPr>
           <w:p>
             <w:pPr>
@@ -5384,13 +5735,13 @@
                 <w:i w:val="0"/>
                 <w:sz w:val="22"/>
               </w:rPr>
-              <w:t>[CHỜ]</w:t>
+              <w:t>98.7</w:t>
             </w:r>
           </w:p>
         </w:tc>
         <w:tc>
           <w:tcPr>
-            <w:tcW w:type="dxa" w:w="1520"/>
+            <w:tcW w:type="dxa" w:w="2280"/>
           </w:tcPr>
           <w:p>
             <w:pPr>
@@ -5403,13 +5754,13 @@
                 <w:i w:val="0"/>
                 <w:sz w:val="22"/>
               </w:rPr>
-              <w:t>[CHỜ]</w:t>
+              <w:t>97.2</w:t>
             </w:r>
           </w:p>
         </w:tc>
         <w:tc>
           <w:tcPr>
-            <w:tcW w:type="dxa" w:w="1520"/>
+            <w:tcW w:type="dxa" w:w="2280"/>
           </w:tcPr>
           <w:p>
             <w:pPr>
@@ -5418,49 +5769,11 @@
             <w:r>
               <w:rPr>
                 <w:rFonts w:ascii="Times New Roman" w:hAnsi="Times New Roman" w:eastAsia="Times New Roman"/>
-                <w:b w:val="0"/>
+                <w:b/>
                 <w:i w:val="0"/>
                 <w:sz w:val="22"/>
               </w:rPr>
-              <w:t>[CHỜ]</w:t>
-            </w:r>
-          </w:p>
-        </w:tc>
-        <w:tc>
-          <w:tcPr>
-            <w:tcW w:type="dxa" w:w="1520"/>
-          </w:tcPr>
-          <w:p>
-            <w:pPr>
-              <w:spacing w:line="240" w:lineRule="auto"/>
-            </w:pPr>
-            <w:r>
-              <w:rPr>
-                <w:rFonts w:ascii="Times New Roman" w:hAnsi="Times New Roman" w:eastAsia="Times New Roman"/>
-                <w:b w:val="0"/>
-                <w:i w:val="0"/>
-                <w:sz w:val="22"/>
-              </w:rPr>
-              <w:t>37.5±37.1</w:t>
-            </w:r>
-          </w:p>
-        </w:tc>
-        <w:tc>
-          <w:tcPr>
-            <w:tcW w:type="dxa" w:w="1520"/>
-          </w:tcPr>
-          <w:p>
-            <w:pPr>
-              <w:spacing w:line="240" w:lineRule="auto"/>
-            </w:pPr>
-            <w:r>
-              <w:rPr>
-                <w:rFonts w:ascii="Times New Roman" w:hAnsi="Times New Roman" w:eastAsia="Times New Roman"/>
-                <w:b w:val="0"/>
-                <w:i w:val="0"/>
-                <w:sz w:val="22"/>
-              </w:rPr>
-              <w:t>–</w:t>
+              <w:t>9.9</w:t>
             </w:r>
           </w:p>
         </w:tc>
@@ -5468,7 +5781,7 @@
       <w:tr>
         <w:tc>
           <w:tcPr>
-            <w:tcW w:type="dxa" w:w="1520"/>
+            <w:tcW w:type="dxa" w:w="2280"/>
           </w:tcPr>
           <w:p>
             <w:pPr>
@@ -5487,7 +5800,7 @@
         </w:tc>
         <w:tc>
           <w:tcPr>
-            <w:tcW w:type="dxa" w:w="1520"/>
+            <w:tcW w:type="dxa" w:w="2280"/>
           </w:tcPr>
           <w:p>
             <w:pPr>
@@ -5500,13 +5813,13 @@
                 <w:i w:val="0"/>
                 <w:sz w:val="22"/>
               </w:rPr>
-              <w:t>[CHỜ]</w:t>
+              <w:t>93.6</w:t>
             </w:r>
           </w:p>
         </w:tc>
         <w:tc>
           <w:tcPr>
-            <w:tcW w:type="dxa" w:w="1520"/>
+            <w:tcW w:type="dxa" w:w="2280"/>
           </w:tcPr>
           <w:p>
             <w:pPr>
@@ -5519,13 +5832,13 @@
                 <w:i w:val="0"/>
                 <w:sz w:val="22"/>
               </w:rPr>
-              <w:t>[CHỜ]</w:t>
+              <w:t>93.4</w:t>
             </w:r>
           </w:p>
         </w:tc>
         <w:tc>
           <w:tcPr>
-            <w:tcW w:type="dxa" w:w="1520"/>
+            <w:tcW w:type="dxa" w:w="2280"/>
           </w:tcPr>
           <w:p>
             <w:pPr>
@@ -5538,45 +5851,7 @@
                 <w:i w:val="0"/>
                 <w:sz w:val="22"/>
               </w:rPr>
-              <w:t>[CHỜ]</w:t>
-            </w:r>
-          </w:p>
-        </w:tc>
-        <w:tc>
-          <w:tcPr>
-            <w:tcW w:type="dxa" w:w="1520"/>
-          </w:tcPr>
-          <w:p>
-            <w:pPr>
-              <w:spacing w:line="240" w:lineRule="auto"/>
-            </w:pPr>
-            <w:r>
-              <w:rPr>
-                <w:rFonts w:ascii="Times New Roman" w:hAnsi="Times New Roman" w:eastAsia="Times New Roman"/>
-                <w:b/>
-                <w:i w:val="0"/>
-                <w:sz w:val="22"/>
-              </w:rPr>
-              <w:t>97.1±1.3</w:t>
-            </w:r>
-          </w:p>
-        </w:tc>
-        <w:tc>
-          <w:tcPr>
-            <w:tcW w:type="dxa" w:w="1520"/>
-          </w:tcPr>
-          <w:p>
-            <w:pPr>
-              <w:spacing w:line="240" w:lineRule="auto"/>
-            </w:pPr>
-            <w:r>
-              <w:rPr>
-                <w:rFonts w:ascii="Times New Roman" w:hAnsi="Times New Roman" w:eastAsia="Times New Roman"/>
-                <w:b w:val="0"/>
-                <w:i w:val="0"/>
-                <w:sz w:val="22"/>
-              </w:rPr>
-              <w:t>–</w:t>
+              <w:t>93.4</w:t>
             </w:r>
           </w:p>
         </w:tc>
@@ -5584,7 +5859,7 @@
       <w:tr>
         <w:tc>
           <w:tcPr>
-            <w:tcW w:type="dxa" w:w="1520"/>
+            <w:tcW w:type="dxa" w:w="2280"/>
           </w:tcPr>
           <w:p>
             <w:pPr>
@@ -5603,7 +5878,7 @@
         </w:tc>
         <w:tc>
           <w:tcPr>
-            <w:tcW w:type="dxa" w:w="1520"/>
+            <w:tcW w:type="dxa" w:w="2280"/>
           </w:tcPr>
           <w:p>
             <w:pPr>
@@ -5616,13 +5891,13 @@
                 <w:i w:val="0"/>
                 <w:sz w:val="22"/>
               </w:rPr>
-              <w:t>[CHỜ]</w:t>
+              <w:t>97.5</w:t>
             </w:r>
           </w:p>
         </w:tc>
         <w:tc>
           <w:tcPr>
-            <w:tcW w:type="dxa" w:w="1520"/>
+            <w:tcW w:type="dxa" w:w="2280"/>
           </w:tcPr>
           <w:p>
             <w:pPr>
@@ -5635,13 +5910,13 @@
                 <w:i w:val="0"/>
                 <w:sz w:val="22"/>
               </w:rPr>
-              <w:t>[CHỜ]</w:t>
+              <w:t>97.5</w:t>
             </w:r>
           </w:p>
         </w:tc>
         <w:tc>
           <w:tcPr>
-            <w:tcW w:type="dxa" w:w="1520"/>
+            <w:tcW w:type="dxa" w:w="2280"/>
           </w:tcPr>
           <w:p>
             <w:pPr>
@@ -5654,45 +5929,7 @@
                 <w:i w:val="0"/>
                 <w:sz w:val="22"/>
               </w:rPr>
-              <w:t>[CHỜ]</w:t>
-            </w:r>
-          </w:p>
-        </w:tc>
-        <w:tc>
-          <w:tcPr>
-            <w:tcW w:type="dxa" w:w="1520"/>
-          </w:tcPr>
-          <w:p>
-            <w:pPr>
-              <w:spacing w:line="240" w:lineRule="auto"/>
-            </w:pPr>
-            <w:r>
-              <w:rPr>
-                <w:rFonts w:ascii="Times New Roman" w:hAnsi="Times New Roman" w:eastAsia="Times New Roman"/>
-                <w:b w:val="0"/>
-                <w:i w:val="0"/>
-                <w:sz w:val="22"/>
-              </w:rPr>
-              <w:t>0.4±0.1</w:t>
-            </w:r>
-          </w:p>
-        </w:tc>
-        <w:tc>
-          <w:tcPr>
-            <w:tcW w:type="dxa" w:w="1520"/>
-          </w:tcPr>
-          <w:p>
-            <w:pPr>
-              <w:spacing w:line="240" w:lineRule="auto"/>
-            </w:pPr>
-            <w:r>
-              <w:rPr>
-                <w:rFonts w:ascii="Times New Roman" w:hAnsi="Times New Roman" w:eastAsia="Times New Roman"/>
-                <w:b w:val="0"/>
-                <w:i w:val="0"/>
-                <w:sz w:val="22"/>
-              </w:rPr>
-              <w:t>–</w:t>
+              <w:t>97.5</w:t>
             </w:r>
           </w:p>
         </w:tc>
@@ -5700,7 +5937,7 @@
       <w:tr>
         <w:tc>
           <w:tcPr>
-            <w:tcW w:type="dxa" w:w="1520"/>
+            <w:tcW w:type="dxa" w:w="2280"/>
           </w:tcPr>
           <w:p>
             <w:pPr>
@@ -5719,7 +5956,7 @@
         </w:tc>
         <w:tc>
           <w:tcPr>
-            <w:tcW w:type="dxa" w:w="1520"/>
+            <w:tcW w:type="dxa" w:w="2280"/>
           </w:tcPr>
           <w:p>
             <w:pPr>
@@ -5732,13 +5969,13 @@
                 <w:i w:val="0"/>
                 <w:sz w:val="22"/>
               </w:rPr>
-              <w:t>[CHỜ]</w:t>
+              <w:t>98.7</w:t>
             </w:r>
           </w:p>
         </w:tc>
         <w:tc>
           <w:tcPr>
-            <w:tcW w:type="dxa" w:w="1520"/>
+            <w:tcW w:type="dxa" w:w="2280"/>
           </w:tcPr>
           <w:p>
             <w:pPr>
@@ -5751,13 +5988,13 @@
                 <w:i w:val="0"/>
                 <w:sz w:val="22"/>
               </w:rPr>
-              <w:t>[CHỜ]</w:t>
+              <w:t>69.0</w:t>
             </w:r>
           </w:p>
         </w:tc>
         <w:tc>
           <w:tcPr>
-            <w:tcW w:type="dxa" w:w="1520"/>
+            <w:tcW w:type="dxa" w:w="2280"/>
           </w:tcPr>
           <w:p>
             <w:pPr>
@@ -5770,45 +6007,7 @@
                 <w:i w:val="0"/>
                 <w:sz w:val="22"/>
               </w:rPr>
-              <w:t>[CHỜ]</w:t>
-            </w:r>
-          </w:p>
-        </w:tc>
-        <w:tc>
-          <w:tcPr>
-            <w:tcW w:type="dxa" w:w="1520"/>
-          </w:tcPr>
-          <w:p>
-            <w:pPr>
-              <w:spacing w:line="240" w:lineRule="auto"/>
-            </w:pPr>
-            <w:r>
-              <w:rPr>
-                <w:rFonts w:ascii="Times New Roman" w:hAnsi="Times New Roman" w:eastAsia="Times New Roman"/>
-                <w:b w:val="0"/>
-                <w:i w:val="0"/>
-                <w:sz w:val="22"/>
-              </w:rPr>
-              <w:t>~42 (±lớn)</w:t>
-            </w:r>
-          </w:p>
-        </w:tc>
-        <w:tc>
-          <w:tcPr>
-            <w:tcW w:type="dxa" w:w="1520"/>
-          </w:tcPr>
-          <w:p>
-            <w:pPr>
-              <w:spacing w:line="240" w:lineRule="auto"/>
-            </w:pPr>
-            <w:r>
-              <w:rPr>
-                <w:rFonts w:ascii="Times New Roman" w:hAnsi="Times New Roman" w:eastAsia="Times New Roman"/>
-                <w:b w:val="0"/>
-                <w:i w:val="0"/>
-                <w:sz w:val="22"/>
-              </w:rPr>
-              <w:t>21.3±36.3</w:t>
+              <w:t>84.8</w:t>
             </w:r>
           </w:p>
         </w:tc>
@@ -5818,20 +6017,37 @@
       <w:r>
         <w:rPr>
           <w:rFonts w:ascii="Times New Roman" w:hAnsi="Times New Roman" w:eastAsia="Times New Roman"/>
-          <w:b w:val="0"/>
-          <w:i/>
-          <w:sz w:val="26"/>
-        </w:rPr>
-        <w:t>Mục tiêu lập luận:</w:t>
-      </w:r>
-      <w:r>
-        <w:rPr>
-          <w:rFonts w:ascii="Times New Roman" w:hAnsi="Times New Roman" w:eastAsia="Times New Roman"/>
-          <w:b w:val="0"/>
-          <w:i w:val="0"/>
-          <w:sz w:val="26"/>
-        </w:rPr>
-        <w:t xml:space="preserve"> cho thấy GeoTox (đặc biệt ở $\tau$ phù hợp / Adaptive) đạt</w:t>
+          <w:b/>
+          <w:i w:val="0"/>
+          <w:sz w:val="26"/>
+        </w:rPr>
+        <w:t>Phát hiện chủ lực.</w:t>
+      </w:r>
+      <w:r>
+        <w:rPr>
+          <w:rFonts w:ascii="Times New Roman" w:hAnsi="Times New Roman" w:eastAsia="Times New Roman"/>
+          <w:b w:val="0"/>
+          <w:i w:val="0"/>
+          <w:sz w:val="26"/>
+        </w:rPr>
+        <w:t xml:space="preserve"> </w:t>
+      </w:r>
+      <w:r>
+        <w:rPr>
+          <w:rFonts w:ascii="Times New Roman" w:hAnsi="Times New Roman" w:eastAsia="Times New Roman"/>
+          <w:b/>
+          <w:i w:val="0"/>
+          <w:sz w:val="26"/>
+        </w:rPr>
+      </w:r>
+      <w:r>
+        <w:rPr>
+          <w:rFonts w:ascii="Times New Roman" w:hAnsi="Times New Roman" w:eastAsia="Times New Roman"/>
+          <w:b w:val="0"/>
+          <w:i w:val="0"/>
+          <w:sz w:val="26"/>
+        </w:rPr>
+        <w:t>Krum chặn hoàn toàn Model-Replacement (ASR 0.6±0.3%)</w:t>
       </w:r>
     </w:p>
     <w:p>
@@ -5842,25 +6058,7 @@
           <w:i w:val="0"/>
           <w:sz w:val="26"/>
         </w:rPr>
-        <w:t xml:space="preserve">ASR </w:t>
-      </w:r>
-      <w:r>
-        <w:rPr>
-          <w:rFonts w:ascii="Times New Roman" w:hAnsi="Times New Roman" w:eastAsia="Times New Roman"/>
-          <w:b/>
-          <w:i w:val="0"/>
-          <w:sz w:val="26"/>
-        </w:rPr>
-        <w:t>cao hơn hoặc tàng hình hơn</w:t>
-      </w:r>
-      <w:r>
-        <w:rPr>
-          <w:rFonts w:ascii="Times New Roman" w:hAnsi="Times New Roman" w:eastAsia="Times New Roman"/>
-          <w:b w:val="0"/>
-          <w:i w:val="0"/>
-          <w:sz w:val="26"/>
-        </w:rPr>
-        <w:t xml:space="preserve"> so với LIE/Min-Max/Model-Replacement dưới cùng</w:t>
+        <w:t>cũng như LIE/Min-Max (MA gần như không đổi), nhưng KHÔNG chặn được GeoTox (ASR</w:t>
       </w:r>
     </w:p>
     <w:p>
@@ -5871,7 +6069,253 @@
           <w:i w:val="0"/>
           <w:sz w:val="26"/>
         </w:rPr>
-        <w:t>phòng thủ — hoặc nêu trung thực nếu một tấn công nền mạnh hơn ở tình huống nào đó.</w:t>
+        <w:t>97.1±1.3%).</w:t>
+      </w:r>
+      <w:r>
+        <w:rPr>
+          <w:rFonts w:ascii="Times New Roman" w:hAnsi="Times New Roman" w:eastAsia="Times New Roman"/>
+          <w:b/>
+          <w:i w:val="0"/>
+          <w:sz w:val="26"/>
+        </w:rPr>
+      </w:r>
+      <w:r>
+        <w:rPr>
+          <w:rFonts w:ascii="Times New Roman" w:hAnsi="Times New Roman" w:eastAsia="Times New Roman"/>
+          <w:b w:val="0"/>
+          <w:i w:val="0"/>
+          <w:sz w:val="26"/>
+        </w:rPr>
+        <w:t xml:space="preserve"> Như vậy GeoTox là tấn công </w:t>
+      </w:r>
+      <w:r>
+        <w:rPr>
+          <w:rFonts w:ascii="Times New Roman" w:hAnsi="Times New Roman" w:eastAsia="Times New Roman"/>
+          <w:b w:val="0"/>
+          <w:i/>
+          <w:sz w:val="26"/>
+        </w:rPr>
+        <w:t>duy nhất trong các tấn công khảo sát</w:t>
+      </w:r>
+    </w:p>
+    <w:p>
+      <w:r>
+        <w:rPr>
+          <w:rFonts w:ascii="Times New Roman" w:hAnsi="Times New Roman" w:eastAsia="Times New Roman"/>
+          <w:b w:val="0"/>
+          <w:i w:val="0"/>
+          <w:sz w:val="26"/>
+        </w:rPr>
+        <w:t>xuyên thủng một phòng thủ robust mà mọi tấn công nền đều thất bại — minh chứng</w:t>
+      </w:r>
+    </w:p>
+    <w:p>
+      <w:r>
+        <w:rPr>
+          <w:rFonts w:ascii="Times New Roman" w:hAnsi="Times New Roman" w:eastAsia="Times New Roman"/>
+          <w:b w:val="0"/>
+          <w:i w:val="0"/>
+          <w:sz w:val="26"/>
+        </w:rPr>
+        <w:t>trực tiếp cho giá trị của tàng hình đa ràng buộc. Độ lệch chuẩn nhỏ (±1.3) cho</w:t>
+      </w:r>
+    </w:p>
+    <w:p>
+      <w:r>
+        <w:rPr>
+          <w:rFonts w:ascii="Times New Roman" w:hAnsi="Times New Roman" w:eastAsia="Times New Roman"/>
+          <w:b w:val="0"/>
+          <w:i w:val="0"/>
+          <w:sz w:val="26"/>
+        </w:rPr>
+        <w:t>thấy kết quả ổn định và lặp lại được.</w:t>
+      </w:r>
+    </w:p>
+    <w:p>
+      <w:r>
+        <w:rPr>
+          <w:rFonts w:ascii="Times New Roman" w:hAnsi="Times New Roman" w:eastAsia="Times New Roman"/>
+          <w:b/>
+          <w:i w:val="0"/>
+          <w:sz w:val="26"/>
+        </w:rPr>
+        <w:t>Các nhận xét trung thực khác.</w:t>
+      </w:r>
+      <w:r>
+        <w:rPr>
+          <w:rFonts w:ascii="Times New Roman" w:hAnsi="Times New Roman" w:eastAsia="Times New Roman"/>
+          <w:b w:val="0"/>
+          <w:i w:val="0"/>
+          <w:sz w:val="26"/>
+        </w:rPr>
+        <w:t xml:space="preserve"> (i) Dưới </w:t>
+      </w:r>
+      <w:r>
+        <w:rPr>
+          <w:rFonts w:ascii="Times New Roman" w:hAnsi="Times New Roman" w:eastAsia="Times New Roman"/>
+          <w:b/>
+          <w:i w:val="0"/>
+          <w:sz w:val="26"/>
+        </w:rPr>
+        <w:t>FedAvg</w:t>
+      </w:r>
+      <w:r>
+        <w:rPr>
+          <w:rFonts w:ascii="Times New Roman" w:hAnsi="Times New Roman" w:eastAsia="Times New Roman"/>
+          <w:b w:val="0"/>
+          <w:i w:val="0"/>
+          <w:sz w:val="26"/>
+        </w:rPr>
+        <w:t xml:space="preserve"> (không phòng thủ),</w:t>
+      </w:r>
+    </w:p>
+    <w:p>
+      <w:r>
+        <w:rPr>
+          <w:rFonts w:ascii="Times New Roman" w:hAnsi="Times New Roman" w:eastAsia="Times New Roman"/>
+          <w:b w:val="0"/>
+          <w:i w:val="0"/>
+          <w:sz w:val="26"/>
+        </w:rPr>
+        <w:t>Model-Replacement (brute-force scaling) đạt 99.8% &gt; GeoTox 37.5% — đúng kỳ vọng:</w:t>
+      </w:r>
+    </w:p>
+    <w:p>
+      <w:r>
+        <w:rPr>
+          <w:rFonts w:ascii="Times New Roman" w:hAnsi="Times New Roman" w:eastAsia="Times New Roman"/>
+          <w:b w:val="0"/>
+          <w:i w:val="0"/>
+          <w:sz w:val="26"/>
+        </w:rPr>
+        <w:t xml:space="preserve">GeoTox </w:t>
+      </w:r>
+      <w:r>
+        <w:rPr>
+          <w:rFonts w:ascii="Times New Roman" w:hAnsi="Times New Roman" w:eastAsia="Times New Roman"/>
+          <w:b/>
+          <w:i w:val="0"/>
+          <w:sz w:val="26"/>
+        </w:rPr>
+        <w:t>hi sinh cường độ để đổi lấy tàng hình</w:t>
+      </w:r>
+      <w:r>
+        <w:rPr>
+          <w:rFonts w:ascii="Times New Roman" w:hAnsi="Times New Roman" w:eastAsia="Times New Roman"/>
+          <w:b w:val="0"/>
+          <w:i w:val="0"/>
+          <w:sz w:val="26"/>
+        </w:rPr>
+        <w:t>, và sự tàng hình chỉ phát huy</w:t>
+      </w:r>
+    </w:p>
+    <w:p>
+      <w:r>
+        <w:rPr>
+          <w:rFonts w:ascii="Times New Roman" w:hAnsi="Times New Roman" w:eastAsia="Times New Roman"/>
+          <w:b w:val="0"/>
+          <w:i w:val="0"/>
+          <w:sz w:val="26"/>
+        </w:rPr>
+        <w:t xml:space="preserve">khi có phòng thủ. (ii) </w:t>
+      </w:r>
+      <w:r>
+        <w:rPr>
+          <w:rFonts w:ascii="Times New Roman" w:hAnsi="Times New Roman" w:eastAsia="Times New Roman"/>
+          <w:b/>
+          <w:i w:val="0"/>
+          <w:sz w:val="26"/>
+        </w:rPr>
+        <w:t>FLTrust là phòng thủ mạnh nhất</w:t>
+      </w:r>
+      <w:r>
+        <w:rPr>
+          <w:rFonts w:ascii="Times New Roman" w:hAnsi="Times New Roman" w:eastAsia="Times New Roman"/>
+          <w:b w:val="0"/>
+          <w:i w:val="0"/>
+          <w:sz w:val="26"/>
+        </w:rPr>
+        <w:t>: chặn mọi tấn công (ASR</w:t>
+      </w:r>
+    </w:p>
+    <w:p>
+      <w:r>
+        <w:rPr>
+          <w:rFonts w:ascii="Times New Roman" w:hAnsi="Times New Roman" w:eastAsia="Times New Roman"/>
+          <w:b w:val="0"/>
+          <w:i w:val="0"/>
+          <w:sz w:val="26"/>
+        </w:rPr>
+        <w:t xml:space="preserve">≤0.4%, MA nguyên vẹn), kể cả GeoTox. (iii) </w:t>
+      </w:r>
+      <w:r>
+        <w:rPr>
+          <w:rFonts w:ascii="Times New Roman" w:hAnsi="Times New Roman" w:eastAsia="Times New Roman"/>
+          <w:b/>
+          <w:i w:val="0"/>
+          <w:sz w:val="26"/>
+        </w:rPr>
+        <w:t>FLAME yếu</w:t>
+      </w:r>
+      <w:r>
+        <w:rPr>
+          <w:rFonts w:ascii="Times New Roman" w:hAnsi="Times New Roman" w:eastAsia="Times New Roman"/>
+          <w:b w:val="0"/>
+          <w:i w:val="0"/>
+          <w:sz w:val="26"/>
+        </w:rPr>
+        <w:t>: thất bại trước cả</w:t>
+      </w:r>
+    </w:p>
+    <w:p>
+      <w:r>
+        <w:rPr>
+          <w:rFonts w:ascii="Times New Roman" w:hAnsi="Times New Roman" w:eastAsia="Times New Roman"/>
+          <w:b w:val="0"/>
+          <w:i w:val="0"/>
+          <w:sz w:val="26"/>
+        </w:rPr>
+        <w:t>Model-Replacement (96.1±3.1%) lẫn GeoTox (đôi khi), và để LIE/Min-Max làm giảm</w:t>
+      </w:r>
+    </w:p>
+    <w:p>
+      <w:r>
+        <w:rPr>
+          <w:rFonts w:ascii="Times New Roman" w:hAnsi="Times New Roman" w:eastAsia="Times New Roman"/>
+          <w:b w:val="0"/>
+          <w:i w:val="0"/>
+          <w:sz w:val="26"/>
+        </w:rPr>
+        <w:t xml:space="preserve">MA. (iv) </w:t>
+      </w:r>
+      <w:r>
+        <w:rPr>
+          <w:rFonts w:ascii="Times New Roman" w:hAnsi="Times New Roman" w:eastAsia="Times New Roman"/>
+          <w:b/>
+          <w:i w:val="0"/>
+          <w:sz w:val="26"/>
+        </w:rPr>
+        <w:t>Min-Max</w:t>
+      </w:r>
+      <w:r>
+        <w:rPr>
+          <w:rFonts w:ascii="Times New Roman" w:hAnsi="Times New Roman" w:eastAsia="Times New Roman"/>
+          <w:b w:val="0"/>
+          <w:i w:val="0"/>
+          <w:sz w:val="26"/>
+        </w:rPr>
+        <w:t xml:space="preserve"> kéo MA của FedAvg xuống 9.9% (untargeted hiệu quả) nhưng bị</w:t>
+      </w:r>
+    </w:p>
+    <w:p>
+      <w:r>
+        <w:rPr>
+          <w:rFonts w:ascii="Times New Roman" w:hAnsi="Times New Roman" w:eastAsia="Times New Roman"/>
+          <w:b w:val="0"/>
+          <w:i w:val="0"/>
+          <w:sz w:val="26"/>
+        </w:rPr>
+        <w:t>Krum/FLTrust vô hiệu hoá.</w:t>
       </w:r>
     </w:p>
     <w:p>
@@ -6173,6 +6617,94 @@
           <w:i w:val="0"/>
           <w:sz w:val="26"/>
         </w:rPr>
+        <w:t>Phát hiện đối chứng then chốt:</w:t>
+      </w:r>
+      <w:r>
+        <w:rPr>
+          <w:rFonts w:ascii="Times New Roman" w:hAnsi="Times New Roman" w:eastAsia="Times New Roman"/>
+          <w:b w:val="0"/>
+          <w:i w:val="0"/>
+          <w:sz w:val="26"/>
+        </w:rPr>
+        <w:t xml:space="preserve"> GeoTox </w:t>
+      </w:r>
+      <w:r>
+        <w:rPr>
+          <w:rFonts w:ascii="Times New Roman" w:hAnsi="Times New Roman" w:eastAsia="Times New Roman"/>
+          <w:b/>
+          <w:i w:val="0"/>
+          <w:sz w:val="26"/>
+        </w:rPr>
+        <w:t>xuyên thủng Krum (ASR 97.1±1.3%)</w:t>
+      </w:r>
+    </w:p>
+    <w:p>
+      <w:r>
+        <w:rPr>
+          <w:rFonts w:ascii="Times New Roman" w:hAnsi="Times New Roman" w:eastAsia="Times New Roman"/>
+          <w:b w:val="0"/>
+          <w:i w:val="0"/>
+          <w:sz w:val="26"/>
+        </w:rPr>
+        <w:t xml:space="preserve">   trong khi các tấn công nền (LIE, Min-Max, Model-Replacement) đều </w:t>
+      </w:r>
+      <w:r>
+        <w:rPr>
+          <w:rFonts w:ascii="Times New Roman" w:hAnsi="Times New Roman" w:eastAsia="Times New Roman"/>
+          <w:b/>
+          <w:i w:val="0"/>
+          <w:sz w:val="26"/>
+        </w:rPr>
+      </w:r>
+      <w:r>
+        <w:rPr>
+          <w:rFonts w:ascii="Times New Roman" w:hAnsi="Times New Roman" w:eastAsia="Times New Roman"/>
+          <w:b w:val="0"/>
+          <w:i w:val="0"/>
+          <w:sz w:val="26"/>
+        </w:rPr>
+        <w:t>bị Krum</w:t>
+      </w:r>
+    </w:p>
+    <w:p>
+      <w:r>
+        <w:rPr>
+          <w:rFonts w:ascii="Times New Roman" w:hAnsi="Times New Roman" w:eastAsia="Times New Roman"/>
+          <w:b w:val="0"/>
+          <w:i w:val="0"/>
+          <w:sz w:val="26"/>
+        </w:rPr>
+        <w:t xml:space="preserve">   chặn hoàn toàn</w:t>
+      </w:r>
+      <w:r>
+        <w:rPr>
+          <w:rFonts w:ascii="Times New Roman" w:hAnsi="Times New Roman" w:eastAsia="Times New Roman"/>
+          <w:b/>
+          <w:i w:val="0"/>
+          <w:sz w:val="26"/>
+        </w:rPr>
+      </w:r>
+      <w:r>
+        <w:rPr>
+          <w:rFonts w:ascii="Times New Roman" w:hAnsi="Times New Roman" w:eastAsia="Times New Roman"/>
+          <w:b w:val="0"/>
+          <w:i w:val="0"/>
+          <w:sz w:val="26"/>
+        </w:rPr>
+        <w:t xml:space="preserve"> — cho thấy giá trị thực của tàng hình đa ràng buộc.</w:t>
+      </w:r>
+    </w:p>
+    <w:p>
+      <w:pPr>
+        <w:pStyle w:val="ListNumber"/>
+      </w:pPr>
+      <w:r>
+        <w:rPr>
+          <w:rFonts w:ascii="Times New Roman" w:hAnsi="Times New Roman" w:eastAsia="Times New Roman"/>
+          <w:b/>
+          <w:i w:val="0"/>
+          <w:sz w:val="26"/>
+        </w:rPr>
         <w:t>Đặc trưng hóa đường cong đánh đổi</w:t>
       </w:r>
       <w:r>
@@ -6182,7 +6714,7 @@
           <w:i w:val="0"/>
           <w:sz w:val="26"/>
         </w:rPr>
-        <w:t xml:space="preserve"> Evasion↔ASR — chứng minh rõ trên Krum.</w:t>
+        <w:t xml:space="preserve"> Evasion↔ASR (rõ trên Krum).</w:t>
       </w:r>
     </w:p>
     <w:p>

</xml_diff>